<commit_message>
docs: visualize the val confusion matrix by error severity
Renders the argument rather than only stating it: the 8x8 matrix is
colored by what each off-diagonal cell means — same-side confusion
(substitutable action), left/right flip (the errors closed-loop cannot
recover from), or STOP timing — next to the left/right/neutral collapse.

Reading it: the red cells are sparse (48 total, 1.97% of all decisions)
while yellow dominates (512, 81.4% of errors), and collapsing to three
directions moves accuracy 74.13% -> 81.65%.

Embedded in both the briefing and the advisor Q&A docx.

Co-Authored-By: Claude Sonnet 5 <noreply@anthropic.com>
</commit_message>
<xml_diff>
--- a/docs/01.paper/EdgeGround-VLA_교수님질문_답변_0817.docx
+++ b/docs/01.paper/EdgeGround-VLA_교수님질문_답변_0817.docx
@@ -1784,6 +1784,56 @@
     </w:tbl>
     <w:p/>
     <w:p>
+      <w:r>
+        <w:drawing>
+          <wp:inline xmlns:a="http://schemas.openxmlformats.org/drawingml/2006/main" xmlns:pic="http://schemas.openxmlformats.org/drawingml/2006/picture">
+            <wp:extent cx="5940000" cy="3701265"/>
+            <wp:docPr id="2" name="Picture 2"/>
+            <wp:cNvGraphicFramePr>
+              <a:graphicFrameLocks noChangeAspect="1"/>
+            </wp:cNvGraphicFramePr>
+            <a:graphic>
+              <a:graphicData uri="http://schemas.openxmlformats.org/drawingml/2006/picture">
+                <pic:pic>
+                  <pic:nvPicPr>
+                    <pic:cNvPr id="0" name="action_head_error_severity.png"/>
+                    <pic:cNvPicPr/>
+                  </pic:nvPicPr>
+                  <pic:blipFill>
+                    <a:blip r:embed="rId10"/>
+                    <a:stretch>
+                      <a:fillRect/>
+                    </a:stretch>
+                  </pic:blipFill>
+                  <pic:spPr>
+                    <a:xfrm>
+                      <a:off x="0" y="0"/>
+                      <a:ext cx="5940000" cy="3701265"/>
+                    </a:xfrm>
+                    <a:prstGeom prst="rect"/>
+                  </pic:spPr>
+                </pic:pic>
+              </a:graphicData>
+            </a:graphic>
+          </wp:inline>
+        </w:drawing>
+      </w:r>
+    </w:p>
+    <w:p>
+      <w:pPr>
+        <w:ind w:left="283"/>
+      </w:pPr>
+      <w:r>
+        <w:rPr>
+          <w:b w:val="0"/>
+          <w:color w:val="606060"/>
+          <w:sz w:val="16"/>
+        </w:rPr>
+        <w:t>좌: 8×8 혼동행렬을 셀 성격별로 구분(초록=정답, 노랑=같은 방향 성향 내 혼동, 빨강=좌우 반전, 회색=STOP 판정 차이). 우: 좌·우·중립 3방향 축약 시 81.65%.</w:t>
+      </w:r>
+    </w:p>
+    <w:p/>
+    <w:p>
       <w:pPr>
         <w:ind w:left="283"/>
       </w:pPr>

</xml_diff>